<commit_message>
docs: standardize report terminology in the specification and dashboard
</commit_message>
<xml_diff>
--- a/SRS.docx
+++ b/SRS.docx
@@ -701,7 +701,7 @@
                 <w:szCs w:val="19"/>
                 <w:rtl w:val="0"/>
               </w:rPr>
-              <w:t xml:space="preserve">Card builder, charts, PDF output</w:t>
+              <w:t xml:space="preserve">Report builder, charts, PDF output</w:t>
             </w:r>
             <w:r>
               <w:rPr>
@@ -992,7 +992,7 @@
           <w:szCs w:val="21"/>
           <w:rtl w:val="0"/>
         </w:rPr>
-        <w:t xml:space="preserve">The CT Civic Data Explorer is a web portal for CTData Collaborative staff to create, publish, and manage dynamic data reports built around datasets. Staff upload datasets, configure custom reports using a report creation wizard with interactive charts and text sections, preview the results, and publish them to a public portal. Public visitors can browse published report cards, view dynamic reports, filter or compare data based on configured controls, and export report views to PDF. The portal replaces manual spreadsheet assembly and repeated formatting with an interactive publishing platform.</w:t>
+        <w:t xml:space="preserve">The CT Civic Data Explorer is a web portal for CTData Collaborative staff to create, publish, and manage dynamic data reports built around datasets. Staff upload datasets, configure custom reports using a report creation wizard with interactive charts and text sections, preview the results, and publish them to a public portal. Public visitors can browse published report reports, view dynamic reports, filter or compare data based on configured controls, and export report views to PDF. The portal replaces manual spreadsheet assembly and repeated formatting with an interactive publishing platform.</w:t>
       </w:r>
       <w:r>
         <w:rPr>
@@ -1096,7 +1096,7 @@
           <w:szCs w:val="21"/>
           <w:rtl w:val="0"/>
         </w:rPr>
-        <w:t xml:space="preserve">The application centers on a dynamic report publishing workflow: dataset ingestion, a multi-step report creation wizard, report management/saving, public report publishing, and secondary PDF export capabilities. Users configure multi-chart interactive reports linked directly to source datasets, preview published views, and make them available on a public card portal where external visitors can view, filter, compare data, and download PDFs.</w:t>
+        <w:t xml:space="preserve">The application centers on a dynamic report publishing workflow: dataset ingestion, a multi-step report creation wizard, report management/saving, public report publishing, and secondary PDF export capabilities. Users configure multi-chart interactive reports linked directly to source datasets, preview published views, and make them available on a public report portal where external visitors can view, filter, compare data, and download PDFs.</w:t>
       </w:r>
       <w:r>
         <w:rPr>
@@ -1350,7 +1350,7 @@
           <w:szCs w:val="21"/>
           <w:rtl w:val="0"/>
         </w:rPr>
-        <w:t xml:space="preserve">Staff also need the final result as a file that can be printed, shared, or attached to an email rather than only viewed on a screen. Since CTData already produces PDFs and briefs, generating Cards and PDFs is an important part of the MVP.</w:t>
+        <w:t xml:space="preserve">Staff also need the final result as a file that can be printed, shared, or attached to an email rather than only viewed on a screen. Since CTData already produces PDFs and briefs, generating Reports and PDFs is an important part of the MVP.</w:t>
       </w:r>
     </w:p>
     <w:p>
@@ -1433,7 +1433,7 @@
           <w:szCs w:val="21"/>
           <w:rtl w:val="0"/>
         </w:rPr>
-        <w:t xml:space="preserve"> Upload datasets with metadata, build multi-chart dynamic reports using a step-by-step wizard, preview, save drafts, and publish report cards to the public portal.</w:t>
+        <w:t xml:space="preserve"> Upload datasets with metadata, build multi-chart dynamic reports using a step-by-step wizard, preview, save drafts, and publish report reports to the public portal.</w:t>
       </w:r>
       <w:r>
         <w:rPr>
@@ -1498,7 +1498,7 @@
           <w:szCs w:val="21"/>
           <w:rtl w:val="0"/>
         </w:rPr>
-        <w:t xml:space="preserve"> Create accurate, consistent cards without engineering assistance.</w:t>
+        <w:t xml:space="preserve"> Create accurate, consistent reports without engineering assistance.</w:t>
       </w:r>
     </w:p>
     <w:p>
@@ -1664,7 +1664,7 @@
           <w:szCs w:val="21"/>
           <w:rtl w:val="0"/>
         </w:rPr>
-        <w:t xml:space="preserve"> Browse published report cards, interactively view reports, filter or compare indicators (towns, schools, etc.), and download reports as PDFs.</w:t>
+        <w:t xml:space="preserve"> Browse published report reports, interactively view reports, filter or compare indicators (towns, schools, etc.), and download reports as PDFs.</w:t>
       </w:r>
       <w:r>
         <w:rPr>
@@ -1803,7 +1803,7 @@
           <w:szCs w:val="21"/>
           <w:rtl w:val="0"/>
         </w:rPr>
-        <w:t xml:space="preserve">As a staff member, I want to log in securely so that I can manage datasets and create cards.</w:t>
+        <w:t xml:space="preserve">As a staff member, I want to log in securely so that I can manage datasets and create reports.</w:t>
       </w:r>
     </w:p>
     <w:p>
@@ -1978,7 +1978,7 @@
           <w:szCs w:val="21"/>
           <w:rtl w:val="0"/>
         </w:rPr>
-        <w:t xml:space="preserve">As a staff member, I want to upload CSV datasets so that updated data is available for cards.</w:t>
+        <w:t xml:space="preserve">As a staff member, I want to upload CSV datasets so that updated data is available for reports.</w:t>
       </w:r>
     </w:p>
     <w:p>
@@ -2364,7 +2364,7 @@
           <w:szCs w:val="21"/>
           <w:rtl w:val="0"/>
         </w:rPr>
-        <w:t xml:space="preserve">Staff can edit the cards they build and save them.</w:t>
+        <w:t xml:space="preserve">Staff can edit the reports they build and save them.</w:t>
       </w:r>
       <w:r>
         <w:rPr>
@@ -2436,7 +2436,7 @@
           <w:szCs w:val="21"/>
           <w:rtl w:val="0"/>
         </w:rPr>
-        <w:t xml:space="preserve"> or public visitor, I want to publish reports to the public card portal and download a PDF so that reports can be shared digitally or offline.</w:t>
+        <w:t xml:space="preserve"> or public visitor, I want to publish reports to the public report portal and download a PDF so that reports can be shared digitally or offline.</w:t>
       </w:r>
       <w:r>
         <w:rPr>
@@ -2498,7 +2498,7 @@
           <w:szCs w:val="21"/>
           <w:rtl w:val="0"/>
         </w:rPr>
-        <w:t xml:space="preserve">Publishing creates a public card displaying the report title, publication date, and summary.</w:t>
+        <w:t xml:space="preserve">Publishing creates a public report displaying the report title, publication date, and summary.</w:t>
       </w:r>
       <w:r>
         <w:rPr>
@@ -2607,7 +2607,7 @@
           <w:szCs w:val="21"/>
           <w:rtl w:val="0"/>
         </w:rPr>
-        <w:t xml:space="preserve">US005: AI-Assisted Card Preparation</w:t>
+        <w:t xml:space="preserve">US005: AI-Assisted Report Preparation</w:t>
       </w:r>
     </w:p>
     <w:p>
@@ -2697,7 +2697,7 @@
           <w:szCs w:val="21"/>
           <w:rtl w:val="0"/>
         </w:rPr>
-        <w:t xml:space="preserve">AI assistance is available within the data-to-card workflow. </w:t>
+        <w:t xml:space="preserve">AI assistance is available within the data-to-report workflow. </w:t>
       </w:r>
     </w:p>
     <w:p>
@@ -3258,7 +3258,7 @@
           <w:szCs w:val="21"/>
           <w:rtl w:val="0"/>
         </w:rPr>
-        <w:t xml:space="preserve">draft reports, manage published cards, and duplicate or reconfigure existing dynamic report structures. The reports contain the data selected from the wizard, along with the text and charts.</w:t>
+        <w:t xml:space="preserve">draft reports, manage published reports, and duplicate or reconfigure existing dynamic report structures. The reports contain the data selected from the wizard, along with the text and charts.</w:t>
       </w:r>
       <w:r>
         <w:rPr>
@@ -3320,7 +3320,7 @@
           <w:szCs w:val="21"/>
           <w:rtl w:val="0"/>
         </w:rPr>
-        <w:t xml:space="preserve">Saving and reopening restores the card selections and content.</w:t>
+        <w:t xml:space="preserve">Saving and reopening restores the report selections and content.</w:t>
       </w:r>
     </w:p>
     <w:p>
@@ -3358,7 +3358,7 @@
           <w:szCs w:val="21"/>
           <w:rtl w:val="0"/>
         </w:rPr>
-        <w:t xml:space="preserve">Staff can rename, duplicate, and delete saved cards.</w:t>
+        <w:t xml:space="preserve">Staff can rename, duplicate, and delete saved reports.</w:t>
       </w:r>
     </w:p>
     <w:p>
@@ -3396,7 +3396,7 @@
           <w:szCs w:val="21"/>
           <w:rtl w:val="0"/>
         </w:rPr>
-        <w:t xml:space="preserve">Cards contain the customized report created with the wizard. Card creat</w:t>
+        <w:t xml:space="preserve">Reports contain the customized report created with the wizard. Report creat</w:t>
       </w:r>
     </w:p>
     <w:p>
@@ -4011,7 +4011,7 @@
                 <w:szCs w:val="21"/>
                 <w:rtl w:val="0"/>
               </w:rPr>
-              <w:t xml:space="preserve">Card builder</w:t>
+              <w:t xml:space="preserve">Report builder</w:t>
             </w:r>
           </w:p>
         </w:tc>
@@ -4205,7 +4205,7 @@
                 <w:szCs w:val="21"/>
                 <w:rtl w:val="0"/>
               </w:rPr>
-              <w:t xml:space="preserve">Card output with charts, notes, and source attribution.</w:t>
+              <w:t xml:space="preserve">Report output with charts, notes, and source attribution.</w:t>
             </w:r>
           </w:p>
         </w:tc>
@@ -4248,7 +4248,7 @@
                 <w:szCs w:val="21"/>
                 <w:rtl w:val="0"/>
               </w:rPr>
-              <w:t xml:space="preserve">Saved cards</w:t>
+              <w:t xml:space="preserve">Saved reports</w:t>
             </w:r>
           </w:p>
         </w:tc>
@@ -4284,7 +4284,7 @@
                 <w:szCs w:val="21"/>
                 <w:rtl w:val="0"/>
               </w:rPr>
-              <w:t xml:space="preserve">Save, reopen, rename, duplicate, and delete cards.</w:t>
+              <w:t xml:space="preserve">Save, reopen, rename, duplicate, and delete reports.</w:t>
             </w:r>
           </w:p>
         </w:tc>
@@ -4363,7 +4363,7 @@
                 <w:szCs w:val="21"/>
                 <w:rtl w:val="0"/>
               </w:rPr>
-              <w:t xml:space="preserve">Interpret selected data and help prepare card content.</w:t>
+              <w:t xml:space="preserve">Interpret selected data and help prepare report content.</w:t>
             </w:r>
           </w:p>
         </w:tc>
@@ -4476,7 +4476,7 @@
           <w:szCs w:val="21"/>
           <w:rtl w:val="0"/>
         </w:rPr>
-        <w:t xml:space="preserve"> Create dataset versions and cards; read datasets, indicators, and saved cards; update card selections and notes; duplicate or delete cards.</w:t>
+        <w:t xml:space="preserve"> Create dataset versions and reports; read datasets, indicators, and saved reports; update report selections and notes; duplicate or delete reports.</w:t>
       </w:r>
     </w:p>
     <w:p>
@@ -4506,7 +4506,7 @@
           <w:szCs w:val="21"/>
           <w:rtl w:val="0"/>
         </w:rPr>
-        <w:t xml:space="preserve"> PostgreSQL stores queryable town data, dataset versions, sources, user sessions, and saved card selections.</w:t>
+        <w:t xml:space="preserve"> PostgreSQL stores queryable town data, dataset versions, sources, user sessions, and saved report selections.</w:t>
       </w:r>
       <w:r>
         <w:rPr>
@@ -4691,7 +4691,7 @@
           <w:szCs w:val="21"/>
           <w:rtl w:val="0"/>
         </w:rPr>
-        <w:t xml:space="preserve"> Card previews load under 1 second; PDF generation completes within 5 seconds.</w:t>
+        <w:t xml:space="preserve"> Report previews load under 1 second; PDF generation completes within 5 seconds.</w:t>
       </w:r>
     </w:p>
     <w:p>
@@ -5720,7 +5720,7 @@
                 <w:szCs w:val="21"/>
                 <w:rtl w:val="0"/>
               </w:rPr>
-              <w:t xml:space="preserve">Navigation to datasets, town views, new cards, saved cards, and logout.</w:t>
+              <w:t xml:space="preserve">Navigation to datasets, town views, new reports, saved reports, and logout.</w:t>
             </w:r>
           </w:p>
         </w:tc>
@@ -5842,7 +5842,7 @@
                 <w:szCs w:val="21"/>
                 <w:rtl w:val="0"/>
               </w:rPr>
-              <w:t xml:space="preserve">Card builder</w:t>
+              <w:t xml:space="preserve">Report builder</w:t>
             </w:r>
           </w:p>
         </w:tc>
@@ -5878,7 +5878,7 @@
                 <w:szCs w:val="21"/>
                 <w:rtl w:val="0"/>
               </w:rPr>
-              <w:t xml:space="preserve">Town and benchmark selectors, indicators, chart options, card blocks, live preview, AI assistance, editable notes, source footer, save, and export.</w:t>
+              <w:t xml:space="preserve">Town and benchmark selectors, indicators, chart options, report blocks, live preview, AI assistance, editable notes, source footer, save, and export.</w:t>
             </w:r>
           </w:p>
         </w:tc>
@@ -5921,7 +5921,7 @@
                 <w:szCs w:val="21"/>
                 <w:rtl w:val="0"/>
               </w:rPr>
-              <w:t xml:space="preserve">Saved card library</w:t>
+              <w:t xml:space="preserve">Saved report library</w:t>
             </w:r>
           </w:p>
         </w:tc>
@@ -5957,7 +5957,7 @@
                 <w:szCs w:val="21"/>
                 <w:rtl w:val="0"/>
               </w:rPr>
-              <w:t xml:space="preserve">Saved cards with open, rename, duplicate, and delete controls.</w:t>
+              <w:t xml:space="preserve">Saved reports with open, rename, duplicate, and delete controls.</w:t>
             </w:r>
           </w:p>
         </w:tc>
@@ -6285,7 +6285,7 @@
           <w:szCs w:val="21"/>
           <w:rtl w:val="0"/>
         </w:rPr>
-        <w:t xml:space="preserve">Routes call dataset, town, card, authentication, and AI services.</w:t>
+        <w:t xml:space="preserve">Routes call dataset, town, report, authentication, and AI services.</w:t>
       </w:r>
     </w:p>
     <w:p>
@@ -6361,7 +6361,7 @@
           <w:szCs w:val="21"/>
           <w:rtl w:val="0"/>
         </w:rPr>
-        <w:t xml:space="preserve">The application returns a page, preview, validation result, or card output.</w:t>
+        <w:t xml:space="preserve">The application returns a page, preview, validation result, or report output.</w:t>
       </w:r>
     </w:p>
     <w:p>
@@ -6615,7 +6615,7 @@
           <w:szCs w:val="21"/>
           <w:rtl w:val="0"/>
         </w:rPr>
-        <w:t xml:space="preserve">☐ All migrations written and applied: users, sessions, datasets, towns, indicators, observations, cards</w:t>
+        <w:t xml:space="preserve">☐ All migrations written and applied: users, sessions, datasets, towns, indicators, observations, reports</w:t>
       </w:r>
     </w:p>
     <w:p>
@@ -6834,7 +6834,7 @@
           <w:szCs w:val="22"/>
           <w:rtl w:val="0"/>
         </w:rPr>
-        <w:t xml:space="preserve">Phase 2: Data and Card Building</w:t>
+        <w:t xml:space="preserve">Phase 2: Data and Report Building</w:t>
       </w:r>
     </w:p>
     <w:p>
@@ -6894,7 +6894,7 @@
           <w:szCs w:val="21"/>
           <w:rtl w:val="0"/>
         </w:rPr>
-        <w:t xml:space="preserve">Datasets can be uploaded and a custom card can be built on screen.</w:t>
+        <w:t xml:space="preserve">Datasets can be uploaded and a custom report can be built on screen.</w:t>
       </w:r>
     </w:p>
     <w:p>
@@ -6999,7 +6999,7 @@
           <w:szCs w:val="21"/>
           <w:rtl w:val="0"/>
         </w:rPr>
-        <w:t xml:space="preserve">☐ Card builder with town, indicator, and block selection and a live preview</w:t>
+        <w:t xml:space="preserve">☐ Report builder with town, indicator, and block selection and a live preview</w:t>
       </w:r>
     </w:p>
     <w:p>
@@ -7120,7 +7120,7 @@
           <w:szCs w:val="21"/>
           <w:rtl w:val="0"/>
         </w:rPr>
-        <w:t xml:space="preserve">card selection format, upload and versioning design, indexed query paths, code review on every pull request.</w:t>
+        <w:t xml:space="preserve">report selection format, upload and versioning design, indexed query paths, code review on every pull request.</w:t>
       </w:r>
     </w:p>
     <w:p>
@@ -7190,7 +7190,7 @@
           <w:szCs w:val="21"/>
           <w:rtl w:val="0"/>
         </w:rPr>
-        <w:t xml:space="preserve">card builder interface, chart rendering and configuration, preview rendering, accessible tables, responsive layout.</w:t>
+        <w:t xml:space="preserve">report builder interface, chart rendering and configuration, preview rendering, accessible tables, responsive layout.</w:t>
       </w:r>
     </w:p>
     <w:p>
@@ -7218,7 +7218,7 @@
           <w:szCs w:val="22"/>
           <w:rtl w:val="0"/>
         </w:rPr>
-        <w:t xml:space="preserve">Phase 3: PDF Generation and Saved Cards</w:t>
+        <w:t xml:space="preserve">Phase 3: PDF Generation and Saved Reports</w:t>
       </w:r>
     </w:p>
     <w:p>
@@ -7363,7 +7363,7 @@
           <w:szCs w:val="21"/>
           <w:rtl w:val="0"/>
         </w:rPr>
-        <w:t xml:space="preserve">☐ Saved card library with open, rename, duplicate, and delete</w:t>
+        <w:t xml:space="preserve">☐ Saved report library with open, rename, duplicate, and delete</w:t>
       </w:r>
     </w:p>
     <w:p>
@@ -7519,7 +7519,7 @@
           <w:szCs w:val="21"/>
           <w:rtl w:val="0"/>
         </w:rPr>
-        <w:t xml:space="preserve">card save and reload logic, PDF endpoint, AI provider call and figure cross-check, ownership checks on every route.</w:t>
+        <w:t xml:space="preserve">report save and reload logic, PDF endpoint, AI provider call and figure cross-check, ownership checks on every route.</w:t>
       </w:r>
     </w:p>
     <w:p>
@@ -7554,7 +7554,7 @@
           <w:szCs w:val="21"/>
           <w:rtl w:val="0"/>
         </w:rPr>
-        <w:t xml:space="preserve">print layout for the PDF, editable summary field in the builder, card library screens, cross-browser and mobile passes.</w:t>
+        <w:t xml:space="preserve">print layout for the PDF, editable summary field in the builder, report library screens, cross-browser and mobile passes.</w:t>
       </w:r>
     </w:p>
     <w:p>
@@ -7748,7 +7748,7 @@
           <w:szCs w:val="21"/>
           <w:rtl w:val="0"/>
         </w:rPr>
-        <w:t xml:space="preserve">☐ User documentation: how to upload a dataset, how to build a card, and an FAQ</w:t>
+        <w:t xml:space="preserve">☐ User documentation: how to upload a dataset, how to build a report, and an FAQ</w:t>
       </w:r>
     </w:p>
     <w:p>
@@ -8531,7 +8531,7 @@
                 <w:szCs w:val="19"/>
                 <w:rtl w:val="0"/>
               </w:rPr>
-              <w:t xml:space="preserve">Progress updates with feature demos of the card builder and charts</w:t>
+              <w:t xml:space="preserve">Progress updates with feature demos of the report builder and charts</w:t>
             </w:r>
             <w:r>
               <w:rPr>
@@ -8605,7 +8605,7 @@
                 <w:szCs w:val="19"/>
                 <w:rtl w:val="0"/>
               </w:rPr>
-              <w:t xml:space="preserve">Progress Report II presentation (client invited): card to PDF demo</w:t>
+              <w:t xml:space="preserve">Progress Report II presentation (client invited): report to PDF demo</w:t>
             </w:r>
             <w:r>
               <w:rPr>
@@ -9093,7 +9093,7 @@
                 <w:szCs w:val="21"/>
                 <w:rtl w:val="0"/>
               </w:rPr>
-              <w:t xml:space="preserve">Derived rates, number formatting, CSV validation, and card selections.</w:t>
+              <w:t xml:space="preserve">Derived rates, number formatting, CSV validation, and report selections.</w:t>
             </w:r>
           </w:p>
         </w:tc>
@@ -9864,7 +9864,7 @@
           <w:szCs w:val="21"/>
           <w:rtl w:val="0"/>
         </w:rPr>
-        <w:t xml:space="preserve">Verify /healthz, log in, build one known card, and generate one PDF.</w:t>
+        <w:t xml:space="preserve">Verify /healthz, log in, build one known report, and generate one PDF.</w:t>
       </w:r>
     </w:p>
     <w:p>
@@ -10464,7 +10464,7 @@
                 <w:szCs w:val="21"/>
                 <w:rtl w:val="0"/>
               </w:rPr>
-              <w:t xml:space="preserve">Keep the semester focused on the internal card tool and review changes against the schedule.</w:t>
+              <w:t xml:space="preserve">Keep the semester focused on the internal report tool and review changes against the schedule.</w:t>
             </w:r>
           </w:p>
         </w:tc>
@@ -10759,7 +10759,7 @@
           <w:szCs w:val="21"/>
           <w:rtl w:val="0"/>
         </w:rPr>
-        <w:t xml:space="preserve">Time to produce a finished card PDF. </w:t>
+        <w:t xml:space="preserve">Time to produce a finished report PDF. </w:t>
       </w:r>
       <w:r>
         <w:rPr>
@@ -10879,7 +10879,7 @@
           <w:szCs w:val="21"/>
           <w:rtl w:val="0"/>
         </w:rPr>
-        <w:t xml:space="preserve">PDF generation under 10 seconds for a four-town card</w:t>
+        <w:t xml:space="preserve">PDF generation under 10 seconds for a four-town report</w:t>
       </w:r>
     </w:p>
     <w:p>
@@ -11353,7 +11353,7 @@
           <w:szCs w:val="21"/>
           <w:rtl w:val="0"/>
         </w:rPr>
-        <w:t xml:space="preserve">Data card: </w:t>
+        <w:t xml:space="preserve">Data report: </w:t>
       </w:r>
       <w:r>
         <w:rPr>
@@ -11537,7 +11537,7 @@
           <w:szCs w:val="21"/>
           <w:rtl w:val="0"/>
         </w:rPr>
-        <w:t xml:space="preserve">The optional two to four sentence narrative drafted from the computed figures and edited by the user before it goes on the card. Never the source of a number.</w:t>
+        <w:t xml:space="preserve">The optional two to four sentence narrative drafted from the computed figures and edited by the user before it goes on the report. Never the source of a number.</w:t>
       </w:r>
     </w:p>
     <w:p>
@@ -11572,7 +11572,7 @@
           <w:szCs w:val="21"/>
           <w:rtl w:val="0"/>
         </w:rPr>
-        <w:t xml:space="preserve">The JSON object describing a card: towns, indicators, blocks, and chart type. Produced by the builder and consumed by the preview and the PDF generator.</w:t>
+        <w:t xml:space="preserve">The JSON object describing a report: towns, indicators, blocks, and chart type. Produced by the builder and consumed by the preview and the PDF generator.</w:t>
       </w:r>
     </w:p>
     <w:p>
@@ -12084,7 +12084,7 @@
                 <w:szCs w:val="19"/>
                 <w:rtl w:val="0"/>
               </w:rPr>
-              <w:t xml:space="preserve">Confirm that a staff-facing card generator, not a public natural-language search, is the scope for this semester.</w:t>
+              <w:t xml:space="preserve">Confirm that a staff-facing report generator, not a public natural-language search, is the scope for this semester.</w:t>
             </w:r>
             <w:r>
               <w:rPr>
@@ -12176,7 +12176,7 @@
                 <w:szCs w:val="19"/>
                 <w:rtl w:val="0"/>
               </w:rPr>
-              <w:t xml:space="preserve">Build the staff-facing generator. Keep the card selection as a standalone JSON object so a query feature remains addable later.</w:t>
+              <w:t xml:space="preserve">Build the staff-facing generator. Keep the report selection as a standalone JSON object so a query feature remains addable later.</w:t>
             </w:r>
             <w:r>
               <w:rPr>
@@ -12250,7 +12250,7 @@
                 <w:szCs w:val="19"/>
                 <w:rtl w:val="0"/>
               </w:rPr>
-              <w:t xml:space="preserve">Confirm CTData brand colors, typography, and logo usage for the card and PDF layout.</w:t>
+              <w:t xml:space="preserve">Confirm CTData brand colors, typography, and logo usage for the report and PDF layout.</w:t>
             </w:r>
             <w:r>
               <w:rPr>
@@ -12914,7 +12914,7 @@
                 <w:szCs w:val="19"/>
                 <w:rtl w:val="0"/>
               </w:rPr>
-              <w:t xml:space="preserve">Which AI provider should draft card summaries, and who holds and pays for the API key after handoff?</w:t>
+              <w:t xml:space="preserve">Which AI provider should draft report summaries, and who holds and pays for the API key after handoff?</w:t>
             </w:r>
             <w:r>
               <w:rPr>
@@ -13128,7 +13128,7 @@
           <w:szCs w:val="21"/>
           <w:rtl w:val="0"/>
         </w:rPr>
-        <w:t xml:space="preserve">☐ Wireframes for the Dashboard, Card Builder, and Dataset Admin screens</w:t>
+        <w:t xml:space="preserve">☐ Wireframes for the Dashboard, Report Builder, and Dataset Admin screens</w:t>
       </w:r>
     </w:p>
     <w:p>
@@ -13148,7 +13148,7 @@
           <w:szCs w:val="21"/>
           <w:rtl w:val="0"/>
         </w:rPr>
-        <w:t xml:space="preserve">☐ Sample card mockup with real ACS 2024 figures, for example West Hartford median household income $129,890 against the Connecticut figure of $95,781</w:t>
+        <w:t xml:space="preserve">☐ Sample report mockup with real ACS 2024 figures, for example West Hartford median household income $129,890 against the Connecticut figure of $95,781</w:t>
       </w:r>
     </w:p>
     <w:p>
@@ -13461,7 +13461,7 @@
                 <w:szCs w:val="19"/>
                 <w:rtl w:val="0"/>
               </w:rPr>
-              <w:t xml:space="preserve">Initial SRS draft: MVP scope set at login, dataset upload, custom card building, charts, AI-drafted summaries, and PDF export</w:t>
+              <w:t xml:space="preserve">Initial SRS draft: MVP scope set at login, dataset upload, custom report building, charts, AI-drafted summaries, and PDF export</w:t>
             </w:r>
             <w:r>
               <w:rPr>

</xml_diff>